<commit_message>
Refresh deliverables and verification for container packaging fix
Co-authored-by: naysilanur20 <naysilanur20@gmail.com>
</commit_message>
<xml_diff>
--- a/published/2026-09-16-hardening/itles_report.docx
+++ b/published/2026-09-16-hardening/itles_report.docx
@@ -7114,11 +7114,11 @@
       <w:r>
         <w:t>{</w:t>
         <w:br/>
-        <w:t xml:space="preserve">  "verified_at_utc": "2026-09-16T11:49:30.919253+00:00",</w:t>
+        <w:t xml:space="preserve">  "verified_at_utc": "2026-09-16T11:59:00.035428+00:00",</w:t>
         <w:br/>
-        <w:t xml:space="preserve">  "source_commit": "0ef650f0632837fea45c154153c6de7d3e8607e4",</w:t>
+        <w:t xml:space="preserve">  "source_commit": "7ee40bfb4a640df511f99d95ed6a74893bfd7d68",</w:t>
         <w:br/>
-        <w:t xml:space="preserve">  "source_fingerprint": "f5311b1bcd7046808ce0d17b00cc4aca6aa7ece8a112502dbe4f374f02a0bcf7",</w:t>
+        <w:t xml:space="preserve">  "source_fingerprint": "7f8b4c676a5768042b9d186c7426b4194c3c5bd8a19f6d9d6899f9f698f54feb",</w:t>
         <w:br/>
         <w:t xml:space="preserve">  "version_scope": "Source commit identifies implementation, tests and instructions. Evidence-only publication commit follows; verification-results.json is excluded from the SHA-256 fingerprint.",</w:t>
         <w:br/>
@@ -7142,7 +7142,9 @@
         <w:br/>
         <w:t xml:space="preserve">    "result": "passed",</w:t>
         <w:br/>
-        <w:t xml:space="preserve">    "scope": "locked dependencies, production frontend build, XLSX/DOCX/PDF/ZIP generation"</w:t>
+        <w:t xml:space="preserve">    "scope": "locked dependencies, production frontend build, XLSX/DOCX/PDF/ZIP generation",</w:t>
+        <w:br/>
+        <w:t xml:space="preserve">    "verified_source_commit": "0ef650f0632837fea45c154153c6de7d3e8607e4"</w:t>
         <w:br/>
         <w:t xml:space="preserve">  },</w:t>
         <w:br/>
@@ -7154,7 +7156,7 @@
         <w:br/>
         <w:t xml:space="preserve">    "failed": 0,</w:t>
         <w:br/>
-        <w:t xml:space="preserve">    "seconds": 56.71,</w:t>
+        <w:t xml:space="preserve">    "seconds": 55.4,</w:t>
         <w:br/>
         <w:t xml:space="preserve">    "warnings": [</w:t>
         <w:br/>
@@ -7182,7 +7184,9 @@
         <w:br/>
         <w:t xml:space="preserve">    "result": "passed",</w:t>
         <w:br/>
-        <w:t xml:space="preserve">    "vite_version": "6.4.3"</w:t>
+        <w:t xml:space="preserve">    "vite_version": "6.4.3",</w:t>
+        <w:br/>
+        <w:t xml:space="preserve">    "scope": "Production build repeated by the isolated Playwright webServer before E2E"</w:t>
         <w:br/>
         <w:t xml:space="preserve">  },</w:t>
         <w:br/>
@@ -7198,9 +7202,9 @@
         <w:br/>
         <w:t xml:space="preserve">    "total_m3": "1234.560000",</w:t>
         <w:br/>
-        <w:t xml:space="preserve">    "ingest_and_retries_seconds": 1.461,</w:t>
+        <w:t xml:space="preserve">    "ingest_and_retries_seconds": 1.044,</w:t>
         <w:br/>
-        <w:t xml:space="preserve">    "fleet_query_seconds": 0.052,</w:t>
+        <w:t xml:space="preserve">    "fleet_query_seconds": 0.05,</w:t>
         <w:br/>
         <w:t xml:space="preserve">    "scope": "synthetic ASGI in-process; not physical network or machinery"</w:t>
         <w:br/>
@@ -7214,7 +7218,7 @@
         <w:br/>
         <w:t xml:space="preserve">    "failed": 0,</w:t>
         <w:br/>
-        <w:t xml:space="preserve">    "seconds": 23.2,</w:t>
+        <w:t xml:space="preserve">    "seconds": 23.5,</w:t>
         <w:br/>
         <w:t xml:space="preserve">    "address": "http://127.0.0.1:3100/",</w:t>
         <w:br/>
@@ -7292,7 +7296,9 @@
         <w:br/>
         <w:t xml:space="preserve">    },</w:t>
         <w:br/>
-        <w:t xml:space="preserve">    "contrast_scope": "Measured current CSS token pairs, not a full WCAG certification"</w:t>
+        <w:t xml:space="preserve">    "contrast_scope": "Measured current CSS token pairs, not a full WCAG certification",</w:t>
+        <w:br/>
+        <w:t xml:space="preserve">    "verified_source_commit": "0ef650f0632837fea45c154153c6de7d3e8607e4"</w:t>
         <w:br/>
         <w:t xml:space="preserve">  },</w:t>
         <w:br/>
@@ -7356,11 +7362,13 @@
         <w:br/>
         <w:t xml:space="preserve">  "github_ci": {</w:t>
         <w:br/>
-        <w:t xml:space="preserve">    "result": "not claimed by local evidence",</w:t>
+        <w:t xml:space="preserve">    "result": "Previous head dbe6dc3eb4ca5222c1aefcc9165fdc887df387e4 passed both jobs; follow-up image archive regression must settle on the new PR head",</w:t>
         <w:br/>
         <w:t xml:space="preserve">    "workflow": ".github/workflows/verify.yml",</w:t>
         <w:br/>
-        <w:t xml:space="preserve">    "instruction": "Read live checks for the published PR head; includes separate Docker job and isolated browser suite."</w:t>
+        <w:t xml:space="preserve">    "previous_verified_run": "https://github.com/naysilanur20/ITles/actions/runs/35092634844",</w:t>
+        <w:br/>
+        <w:t xml:space="preserve">    "instruction": "Read live checks for the published head, not the previous result."</w:t>
         <w:br/>
         <w:t xml:space="preserve">  },</w:t>
         <w:br/>
@@ -7382,7 +7390,25 @@
         <w:br/>
         <w:t xml:space="preserve">    "No claim of real-file or real-machine readiness"</w:t>
         <w:br/>
-        <w:t xml:space="preserve">  ]</w:t>
+        <w:t xml:space="preserve">  ],</w:t>
+        <w:br/>
+        <w:t xml:space="preserve">  "release_followup": {</w:t>
+        <w:br/>
+        <w:t xml:space="preserve">    "change": "Include HANDOFF and browser test sources/config in Docker context; run delivery regressions inside the built image",</w:t>
+        <w:br/>
+        <w:t xml:space="preserve">    "files": [</w:t>
+        <w:br/>
+        <w:t xml:space="preserve">      ".dockerignore",</w:t>
+        <w:br/>
+        <w:t xml:space="preserve">      ".github/workflows/verify.yml"</w:t>
+        <w:br/>
+        <w:t xml:space="preserve">    ],</w:t>
+        <w:br/>
+        <w:t xml:space="preserve">    "local_checks": "146 Python, 67 frontend, 7 isolated browser scenarios passed; 14 focused delivery/deployment checks passed",</w:t>
+        <w:br/>
+        <w:t xml:space="preserve">    "configuration_impact": "No new required environment variables, schema migrations or secret rotation; existing production defaults preserved"</w:t>
+        <w:br/>
+        <w:t xml:space="preserve">  }</w:t>
         <w:br/>
         <w:t>}</w:t>
         <w:br/>

</xml_diff>

<commit_message>
Refresh delivery evidence for deterministic logout regression
Co-authored-by: naysilanur20 <naysilanur20@gmail.com>
</commit_message>
<xml_diff>
--- a/published/2026-09-16-hardening/itles_report.docx
+++ b/published/2026-09-16-hardening/itles_report.docx
@@ -7114,11 +7114,11 @@
       <w:r>
         <w:t>{</w:t>
         <w:br/>
-        <w:t xml:space="preserve">  "verified_at_utc": "2026-09-16T11:59:00.035428+00:00",</w:t>
+        <w:t xml:space="preserve">  "verified_at_utc": "2026-09-16T12:09:07.082082+00:00",</w:t>
         <w:br/>
-        <w:t xml:space="preserve">  "source_commit": "7ee40bfb4a640df511f99d95ed6a74893bfd7d68",</w:t>
+        <w:t xml:space="preserve">  "source_commit": "490cf4f975396d8025babb50de1e8a70318e00fb",</w:t>
         <w:br/>
-        <w:t xml:space="preserve">  "source_fingerprint": "7f8b4c676a5768042b9d186c7426b4194c3c5bd8a19f6d9d6899f9f698f54feb",</w:t>
+        <w:t xml:space="preserve">  "source_fingerprint": "f731153d1b4ba6ae2f90f88e9f2df7cea64e2f5f10565b3cb3c685114d711c04",</w:t>
         <w:br/>
         <w:t xml:space="preserve">  "version_scope": "Source commit identifies implementation, tests and instructions. Evidence-only publication commit follows; verification-results.json is excluded from the SHA-256 fingerprint.",</w:t>
         <w:br/>
@@ -7156,7 +7156,7 @@
         <w:br/>
         <w:t xml:space="preserve">    "failed": 0,</w:t>
         <w:br/>
-        <w:t xml:space="preserve">    "seconds": 55.4,</w:t>
+        <w:t xml:space="preserve">    "seconds": 62.59,</w:t>
         <w:br/>
         <w:t xml:space="preserve">    "warnings": [</w:t>
         <w:br/>
@@ -7202,7 +7202,7 @@
         <w:br/>
         <w:t xml:space="preserve">    "total_m3": "1234.560000",</w:t>
         <w:br/>
-        <w:t xml:space="preserve">    "ingest_and_retries_seconds": 1.044,</w:t>
+        <w:t xml:space="preserve">    "ingest_and_retries_seconds": 1.041,</w:t>
         <w:br/>
         <w:t xml:space="preserve">    "fleet_query_seconds": 0.05,</w:t>
         <w:br/>
@@ -7218,7 +7218,7 @@
         <w:br/>
         <w:t xml:space="preserve">    "failed": 0,</w:t>
         <w:br/>
-        <w:t xml:space="preserve">    "seconds": 23.5,</w:t>
+        <w:t xml:space="preserve">    "seconds": 29.7,</w:t>
         <w:br/>
         <w:t xml:space="preserve">    "address": "http://127.0.0.1:3100/",</w:t>
         <w:br/>
@@ -7228,7 +7228,7 @@
         <w:br/>
         <w:t xml:space="preserve">    "scenarios": [</w:t>
         <w:br/>
-        <w:t xml:space="preserve">      "UI company registration, preserve one-time recovery code until acknowledged, logout/login, machine and source persisted across reload",</w:t>
+        <w:t xml:space="preserve">      "UI company registration, preserve one-time recovery code until acknowledged, gated real logout request and original-cookie revocation, login, machine and source persisted across reload",</w:t>
         <w:br/>
         <w:t xml:space="preserve">      "UI invitation/activation, read-only employee API authorization, session termination and access revocation",</w:t>
         <w:br/>
@@ -7240,11 +7240,11 @@
         <w:br/>
         <w:t xml:space="preserve">      "Disabled demo/options failure simulated in browser, keyboard focus and mobile widths",</w:t>
         <w:br/>
-        <w:t xml:space="preserve">      "Demo 503 simulated in browser, safe diagnostics, explicit successful retry"</w:t>
+        <w:t xml:space="preserve">      "Demo HTML 405 and JSON 404 simulated in browser, safe diagnostics and explicit retry"</w:t>
         <w:br/>
         <w:t xml:space="preserve">    ],</w:t>
         <w:br/>
-        <w:t xml:space="preserve">    "network_mock_scope": "Only disabled/unavailable-demo/error UI scenarios intercept requests; all company/access/source/data flows use the real API.",</w:t>
+        <w:t xml:space="preserve">    "network_mock_scope": "Disabled/unavailable-demo/error UI scenarios substitute responses. Registration additionally gates one logout request, then forwards it to the real server without substituting its response. All company/access/source/data flows use the real API.",</w:t>
         <w:br/>
         <w:t xml:space="preserve">    "secret_artifacts": "Screenshots, traces and video disabled; only synthetic fixtures and assertion results retained."</w:t>
         <w:br/>
@@ -7362,11 +7362,11 @@
         <w:br/>
         <w:t xml:space="preserve">  "github_ci": {</w:t>
         <w:br/>
-        <w:t xml:space="preserve">    "result": "Previous head dbe6dc3eb4ca5222c1aefcc9165fdc887df387e4 passed both jobs; follow-up image archive regression must settle on the new PR head",</w:t>
+        <w:t xml:space="preserve">    "result": "Previous head 63639ce4615f5b8659f94f8aa83ec6ec94a74ddb passed the pull_request workflow and both container jobs, but its push browser test raced logout. The fixed head requires fresh live CI results.",</w:t>
         <w:br/>
         <w:t xml:space="preserve">    "workflow": ".github/workflows/verify.yml",</w:t>
         <w:br/>
-        <w:t xml:space="preserve">    "previous_verified_run": "https://github.com/naysilanur20/ITles/actions/runs/35092634844",</w:t>
+        <w:t xml:space="preserve">    "previous_verified_run": "https://github.com/naysilanur20/ITles/actions/runs/35093423652",</w:t>
         <w:br/>
         <w:t xml:space="preserve">    "instruction": "Read live checks for the published head, not the previous result."</w:t>
         <w:br/>
@@ -7407,6 +7407,28 @@
         <w:t xml:space="preserve">    "local_checks": "146 Python, 67 frontend, 7 isolated browser scenarios passed; 14 focused delivery/deployment checks passed",</w:t>
         <w:br/>
         <w:t xml:space="preserve">    "configuration_impact": "No new required environment variables, schema migrations or secret rotation; existing production defaults preserved"</w:t>
+        <w:br/>
+        <w:t xml:space="preserve">  },</w:t>
+        <w:br/>
+        <w:t xml:space="preserve">  "ci_logout_regression": {</w:t>
+        <w:br/>
+        <w:t xml:space="preserve">    "failed_run": "https://github.com/naysilanur20/ITles/actions/runs/35093418912/job/104784890058",</w:t>
+        <w:br/>
+        <w:t xml:space="preserve">    "cause": "The browser test checked /api/auth/me immediately after clicking logout, before POST /api/auth/logout completed; the session could correctly still return 200.",</w:t>
+        <w:br/>
+        <w:t xml:space="preserve">    "reproduction": "Holding the real logout request behind an explicit gate reproduced the same expected-401/received-200 failure locally before the fix.",</w:t>
+        <w:br/>
+        <w:t xml:space="preserve">    "fix": "All browser logout paths wait for the POST response and entry UI, then replay the original cookie and require 401. The gated scenario also checks that the app remains signed in with a disabled logout button while the request is pending.",</w:t>
+        <w:br/>
+        <w:t xml:space="preserve">    "repeat_command": "npm --prefix frontend run test:e2e -- --grep 'UI registration' --repeat-each=10",</w:t>
+        <w:br/>
+        <w:t xml:space="preserve">    "repeat_passed": 10,</w:t>
+        <w:br/>
+        <w:t xml:space="preserve">    "repeat_failed": 0,</w:t>
+        <w:br/>
+        <w:t xml:space="preserve">    "repeat_seconds": 53.3,</w:t>
+        <w:br/>
+        <w:t xml:space="preserve">    "scope": "Test synchronization only; no application, authentication policy, CI retries or timeout changes."</w:t>
         <w:br/>
         <w:t xml:space="preserve">  }</w:t>
         <w:br/>

</xml_diff>

<commit_message>
Record embedded login regression and external preview blocker
Co-authored-by: naysilanur20 <naysilanur20@gmail.com>
</commit_message>
<xml_diff>
--- a/published/2026-09-16-hardening/itles_report.docx
+++ b/published/2026-09-16-hardening/itles_report.docx
@@ -912,7 +912,33 @@
     <w:p>
       <w:pPr/>
       <w:r>
-        <w:t>Шаблон статического сайта находит frontend/package.json, собирает Vite и копирует только dist в Nginx. Это размещает интерфейс, но не запускает Python API и SQLite. Тогда GET /api/health может возвращать HTML с кодом 200, а POST /api/auth/login и POST /api/auth/demo — Nginx 405. Успешная сборка фронтенда не доказывает работоспособность входа. HTML/405 от статического nginx встречался в прежнем размещении. Это не диагноз нынешнего отказа: точный адрес пользовательского сбоя пока не предоставлен.</w:t>
+        <w:t>Шаблон статического сайта находит frontend/package.json, собирает Vite и копирует только dist в Nginx. Это размещает интерфейс, но не запускает Python API и SQLite. Тогда GET /api/health может возвращать HTML с кодом 200, а POST /api/auth/login и POST /api/auth/demo — Nginx 405. Успешная сборка фронтенда не доказывает работоспособность входа. HTML/405 от статического nginx встречался в прежнем размещении. Это не диагноз отказа от 16.09.2026: пользователь сообщил HTTPS-адрес Preview и отказ session_not_retained после принятого входа (12:59:04.835 UTC).</w:t>
+      </w:r>
+    </w:p>
+    <w:p>
+      <w:pPr>
+        <w:pStyle w:val="Heading2"/>
+      </w:pPr>
+      <w:r>
+        <w:t>Вход из встроенного Preview</w:t>
+      </w:r>
+    </w:p>
+    <w:p>
+      <w:pPr/>
+      <w:r>
+        <w:t>Ключ для учебного парка не нужен. Во встроенном окне нажмите «Открыть ИТлес в новой вкладке», затем «Посмотреть демо». Вход и регистрация выполняются только в отдельной вкладке: SameSite=Strict не позволяет использовать сеанс в iframe другого сайта. Браузерная регрессия воспроизводит принятый POST (200), отсутствие сохранённой cookie и последующий /api/auth/me (401); переход в отдельную вкладку проверен с входом, reload и выходом.</w:t>
+      </w:r>
+    </w:p>
+    <w:p>
+      <w:pPr/>
+      <w:r>
+        <w:t>Это подтверждает дефект встроенного сценария, но не доказывает исправность внешнего шлюза: адрес пользователя в агентском браузере требует авторизации Hoplite. Его заголовки Cookie/Set-Cookie сквозным тестом не проверены. Если ошибка возникает и в отдельной вкладке, проверяйте прокси и хранение сеансов, не отключайте защиту cookies. Диагностика теперь указывает контекст окна.</w:t>
+      </w:r>
+    </w:p>
+    <w:p>
+      <w:pPr/>
+      <w:r>
+        <w:t>.hoplite/run.sh по умолчанию включает ITLES_COOKIE_SECURE=1 для HTTPS Preview. Исключение ITLES_COOKIE_SECURE=0 допускается только при явном запуске частного локального HTTP-стенда; браузерные тесты используют собственную временную БД.</w:t>
       </w:r>
     </w:p>
     <w:p>
@@ -7114,11 +7140,11 @@
       <w:r>
         <w:t>{</w:t>
         <w:br/>
-        <w:t xml:space="preserve">  "verified_at_utc": "2026-09-16T12:09:07.082082+00:00",</w:t>
+        <w:t xml:space="preserve">  "verified_at_utc": "2026-09-16T13:16:54.458467+00:00",</w:t>
         <w:br/>
-        <w:t xml:space="preserve">  "source_commit": "490cf4f975396d8025babb50de1e8a70318e00fb",</w:t>
+        <w:t xml:space="preserve">  "source_commit": "5f8ef526de1fc0be691dc44ad5a5f974f8f856ee",</w:t>
         <w:br/>
-        <w:t xml:space="preserve">  "source_fingerprint": "f731153d1b4ba6ae2f90f88e9f2df7cea64e2f5f10565b3cb3c685114d711c04",</w:t>
+        <w:t xml:space="preserve">  "source_fingerprint": "71cc1f7c90ba1acf15174875fc294aef700a902cef389c2543b5a7ecce736579",</w:t>
         <w:br/>
         <w:t xml:space="preserve">  "version_scope": "Source commit identifies implementation, tests and instructions. Evidence-only publication commit follows; verification-results.json is excluded from the SHA-256 fingerprint.",</w:t>
         <w:br/>
@@ -7144,7 +7170,7 @@
         <w:br/>
         <w:t xml:space="preserve">    "scope": "locked dependencies, production frontend build, XLSX/DOCX/PDF/ZIP generation",</w:t>
         <w:br/>
-        <w:t xml:space="preserve">    "verified_source_commit": "0ef650f0632837fea45c154153c6de7d3e8607e4"</w:t>
+        <w:t xml:space="preserve">    "verified_source_commit": "5f8ef526de1fc0be691dc44ad5a5f974f8f856ee"</w:t>
         <w:br/>
         <w:t xml:space="preserve">  },</w:t>
         <w:br/>
@@ -7156,7 +7182,7 @@
         <w:br/>
         <w:t xml:space="preserve">    "failed": 0,</w:t>
         <w:br/>
-        <w:t xml:space="preserve">    "seconds": 62.59,</w:t>
+        <w:t xml:space="preserve">    "seconds": 45.13,</w:t>
         <w:br/>
         <w:t xml:space="preserve">    "warnings": [</w:t>
         <w:br/>
@@ -7192,6 +7218,8 @@
         <w:br/>
         <w:t xml:space="preserve">  "stress": {</w:t>
         <w:br/>
+        <w:t xml:space="preserve">    "verified_source_commit": "490cf4f975396d8025babb50de1e8a70318e00fb",</w:t>
+        <w:br/>
         <w:t xml:space="preserve">    "command": ".venv/bin/python -m scripts.stress_synthetic --records 10000",</w:t>
         <w:br/>
         <w:t xml:space="preserve">    "result": "passed",</w:t>
@@ -7214,17 +7242,17 @@
         <w:br/>
         <w:t xml:space="preserve">    "command": "npm --prefix frontend run test:e2e",</w:t>
         <w:br/>
-        <w:t xml:space="preserve">    "passed": 7,</w:t>
+        <w:t xml:space="preserve">    "passed": 9,</w:t>
         <w:br/>
         <w:t xml:space="preserve">    "failed": 0,</w:t>
         <w:br/>
-        <w:t xml:space="preserve">    "seconds": 29.7,</w:t>
+        <w:t xml:space="preserve">    "seconds": 21.0,</w:t>
         <w:br/>
         <w:t xml:space="preserve">    "address": "http://127.0.0.1:3100/",</w:t>
         <w:br/>
         <w:t xml:space="preserve">    "configuration": "Playwright-owned full FastAPI server, temporary SQLite removed after run, demo and registration enabled, local HTTP-only cookie mode; no production data",</w:t>
         <w:br/>
-        <w:t xml:space="preserve">    "suite": "frontend/e2e/flows.e2e.ts",</w:t>
+        <w:t xml:space="preserve">    "suite": "frontend/e2e/flows.e2e.ts and frontend/e2e/embedded-auth.e2e.ts",</w:t>
         <w:br/>
         <w:t xml:space="preserve">    "scenarios": [</w:t>
         <w:br/>
@@ -7240,11 +7268,15 @@
         <w:br/>
         <w:t xml:space="preserve">      "Disabled demo/options failure simulated in browser, keyboard focus and mobile widths",</w:t>
         <w:br/>
-        <w:t xml:space="preserve">      "Demo HTML 405 and JSON 404 simulated in browser, safe diagnostics and explicit retry"</w:t>
+        <w:t xml:space="preserve">      "Demo HTML 405 and JSON 404 simulated in browser, safe diagnostics and explicit retry",</w:t>
+        <w:br/>
+        <w:t xml:space="preserve">      "Cross-site iframe with real API: POST /auth/demo 200, missing Strict cookie, GET /auth/me 401",</w:t>
+        <w:br/>
+        <w:t xml:space="preserve">      "Embedded UI sends no auth mutation; standalone link, demo without key, confirmed session, reload and logout"</w:t>
         <w:br/>
         <w:t xml:space="preserve">    ],</w:t>
         <w:br/>
-        <w:t xml:space="preserve">    "network_mock_scope": "Disabled/unavailable-demo/error UI scenarios substitute responses. Registration additionally gates one logout request, then forwards it to the real server without substituting its response. All company/access/source/data flows use the real API.",</w:t>
+        <w:t xml:space="preserve">    "network_mock_scope": "Disabled/unavailable-demo/error UI scenarios substitute responses. Registration gates one logout request, then forwards it to the real server. Embedded tests substitute only parent HTML; localhost parent receives local-network-access permission to load the real loopback app. Browser cookie policy and application/API responses are not modified.",</w:t>
         <w:br/>
         <w:t xml:space="preserve">    "secret_artifacts": "Screenshots, traces and video disabled; only synthetic fixtures and assertion results retained."</w:t>
         <w:br/>
@@ -7314,9 +7346,15 @@
         <w:br/>
         <w:t xml:space="preserve">  "demo_incident": {</w:t>
         <w:br/>
-        <w:t xml:space="preserve">    "user_url": null,</w:t>
+        <w:t xml:space="preserve">    "user_url": "HTTPS Hoplite Preview; private hostname redacted",</w:t>
         <w:br/>
-        <w:t xml:space="preserve">    "root_cause_at_user_url": "not established",</w:t>
+        <w:t xml:space="preserve">    "reported_at_utc": "2026-09-16T12:59:04.835Z",</w:t>
+        <w:br/>
+        <w:t xml:space="preserve">    "reported_build": "490cf4f97539",</w:t>
+        <w:br/>
+        <w:t xml:space="preserve">    "reported_code": "session_not_retained",</w:t>
+        <w:br/>
+        <w:t xml:space="preserve">    "root_cause_at_user_url": "Cross-site iframe session failure reproduced locally. User window context and authenticated external proxy behavior remain unverified: external address redirects agent browser to Hoplite login.",</w:t>
         <w:br/>
         <w:t xml:space="preserve">    "confirmed_code_defects": [</w:t>
         <w:br/>
@@ -7324,11 +7362,15 @@
         <w:br/>
         <w:t xml:space="preserve">      "ingest could reserve fixed demo event UUIDs before seed",</w:t>
         <w:br/>
-        <w:t xml:space="preserve">      "existing seed identity collision returned unhandled 500"</w:t>
+        <w:t xml:space="preserve">      "existing seed identity collision returned unhandled 500",</w:t>
+        <w:br/>
+        <w:t xml:space="preserve">      "embedded login offered cookie-dependent auth in a cross-site frame where Strict cookies cannot be retained"</w:t>
         <w:br/>
         <w:t xml:space="preserve">    ],</w:t>
         <w:br/>
-        <w:t xml:space="preserve">    "current_behavior": "reserved identifiers rejected; existing conflict gets 503 JSON with rollback, no deletion of other organizations or sessions"</w:t>
+        <w:t xml:space="preserve">    "current_behavior": "reserved identifiers rejected; existing conflict gets 503 JSON with rollback. Embedded entry now opens a standalone tab before auth; no key needed for demo. Strict/HttpOnly and confirmed-session check unchanged; HTTPS Preview defaults to Secure=1. No company/session deletion.",</w:t>
+        <w:br/>
+        <w:t xml:space="preserve">    "managed_preview": "Blocked after deliberate process restart to apply Secure default: preview_start returns old exited PID and cannot relaunch. Repository setup succeeds; sandbox_restart is not configured. Temporary run override did not help and was cleared. Reported to platform; no claim of current external readiness."</w:t>
         <w:br/>
         <w:t xml:space="preserve">  },</w:t>
         <w:br/>
@@ -7362,7 +7404,7 @@
         <w:br/>
         <w:t xml:space="preserve">  "github_ci": {</w:t>
         <w:br/>
-        <w:t xml:space="preserve">    "result": "Previous head 63639ce4615f5b8659f94f8aa83ec6ec94a74ddb passed the pull_request workflow and both container jobs, but its push browser test raced logout. The fixed head requires fresh live CI results.",</w:t>
+        <w:t xml:space="preserve">    "result": "At source head 5f8ef52 both container jobs and push synthetic job passed; pull_request synthetic job was still running at the observed snapshot. Publication head needs live checks. CI does not validate the authenticated external Preview.",</w:t>
         <w:br/>
         <w:t xml:space="preserve">    "workflow": ".github/workflows/verify.yml",</w:t>
         <w:br/>
@@ -7374,7 +7416,9 @@
         <w:br/>
         <w:t xml:space="preserve">  "limitations": [</w:t>
         <w:br/>
-        <w:t xml:space="preserve">    "No customer URL or conditions for external demo failure",</w:t>
+        <w:t xml:space="preserve">    "User supplied URL and diagnostics; external authenticated proxy and user browser window context remain unverified",</w:t>
+        <w:br/>
+        <w:t xml:space="preserve">    "Managed Preview relaunch blocked by platform lifecycle; successful isolated E2E is not current user access",</w:t>
         <w:br/>
         <w:t xml:space="preserve">    "No customer server changed; real HTTPS/storage/backup configuration unverified",</w:t>
         <w:br/>
@@ -7404,13 +7448,17 @@
         <w:br/>
         <w:t xml:space="preserve">    ],</w:t>
         <w:br/>
-        <w:t xml:space="preserve">    "local_checks": "146 Python, 67 frontend, 7 isolated browser scenarios passed; 14 focused delivery/deployment checks passed",</w:t>
+        <w:t xml:space="preserve">    "local_checks": "146 Python, 67 frontend, 9 isolated browser scenarios passed; TypeScript and production build passed",</w:t>
         <w:br/>
-        <w:t xml:space="preserve">    "configuration_impact": "No new required environment variables, schema migrations or secret rotation; existing production defaults preserved"</w:t>
+        <w:t xml:space="preserve">    "configuration_impact": "Preview run defaults ITLES_COOKIE_SECURE to 1 for HTTPS; local HTTP tests explicitly use 0. No new required variables, secrets, schema, IAM, DNS, Terraform, cron, OAuth, webhook or feature-flag provisioning. No project script overrides retained.",</w:t>
+        <w:br/>
+        <w:t xml:space="preserve">    "before_merge": "Restore managed Preview and verify user-facing HTTPS standalone demo admission, /me, reload and logout. Do not merge on isolated CI alone."</w:t>
         <w:br/>
         <w:t xml:space="preserve">  },</w:t>
         <w:br/>
         <w:t xml:space="preserve">  "ci_logout_regression": {</w:t>
+        <w:br/>
+        <w:t xml:space="preserve">    "verified_source_commit": "490cf4f975396d8025babb50de1e8a70318e00fb",</w:t>
         <w:br/>
         <w:t xml:space="preserve">    "failed_run": "https://github.com/naysilanur20/ITles/actions/runs/35093418912/job/104784890058",</w:t>
         <w:br/>

</xml_diff>

<commit_message>
Refresh delivery evidence after final configuration audit
Co-authored-by: naysilanur20 <naysilanur20@gmail.com>
</commit_message>
<xml_diff>
--- a/published/2026-09-16-hardening/itles_report.docx
+++ b/published/2026-09-16-hardening/itles_report.docx
@@ -6866,14 +6866,14 @@
       <w:r>
         <w:t>bash .hoplite/setup.sh</w:t>
         <w:br/>
-        <w:t>bash .hoplite/run.sh</w:t>
+        <w:t>ITLES_COOKIE_SECURE=0 bash .hoplite/run.sh</w:t>
         <w:br/>
       </w:r>
     </w:p>
     <w:p>
       <w:pPr/>
       <w:r>
-        <w:t>Откройте http://localhost:3000 и выберите «Посмотреть демо». Этот run-скрипт предназначен только для Preview: он по умолчанию включает учебные данные и допускает cookie по локальному HTTP. Настройки приложения по умолчанию обратные: demo выключен, cookie Secure включён. База создаётся в .local/; она, ключи и окружение не входят в Git или архив исходников.</w:t>
+        <w:t>Откройте http://localhost:3000 и выберите «Посмотреть демо». Команда выше предназначена только для частного локального HTTP-стенда: исключение ITLES_COOKIE_SECURE=0 задано явно. Сам .hoplite/run.sh по умолчанию включает учебные данные и защищённые Secure-cookie для HTTPS Preview. В публичном Preview запускайте его без этого исключения, открывайте отдельную вкладку и нажимайте «Посмотреть демо» — ключ не нужен. Настройки приложения без run-скрипта: demo выключен, Secure-cookie включены. База создаётся в .local/; она, ключи и окружение не входят в Git или архив исходников.</w:t>
       </w:r>
     </w:p>
     <w:p>
@@ -7140,11 +7140,11 @@
       <w:r>
         <w:t>{</w:t>
         <w:br/>
-        <w:t xml:space="preserve">  "verified_at_utc": "2026-09-16T13:16:54.458467+00:00",</w:t>
+        <w:t xml:space="preserve">  "verified_at_utc": "2026-09-16T13:24:59.742143+00:00",</w:t>
         <w:br/>
-        <w:t xml:space="preserve">  "source_commit": "5f8ef526de1fc0be691dc44ad5a5f974f8f856ee",</w:t>
+        <w:t xml:space="preserve">  "source_commit": "6236586f428b52e9dd088427d399c14da8e53c62",</w:t>
         <w:br/>
-        <w:t xml:space="preserve">  "source_fingerprint": "71cc1f7c90ba1acf15174875fc294aef700a902cef389c2543b5a7ecce736579",</w:t>
+        <w:t xml:space="preserve">  "source_fingerprint": "faaa26f37abade5d93955e309c88eb50cf18287f5c25482366481e8bbb79d69e",</w:t>
         <w:br/>
         <w:t xml:space="preserve">  "version_scope": "Source commit identifies implementation, tests and instructions. Evidence-only publication commit follows; verification-results.json is excluded from the SHA-256 fingerprint.",</w:t>
         <w:br/>
@@ -7176,6 +7176,8 @@
         <w:br/>
         <w:t xml:space="preserve">  "python": {</w:t>
         <w:br/>
+        <w:t xml:space="preserve">    "verified_source_commit": "5f8ef526de1fc0be691dc44ad5a5f974f8f856ee",</w:t>
+        <w:br/>
         <w:t xml:space="preserve">    "command": ".venv/bin/python -m pytest -q",</w:t>
         <w:br/>
         <w:t xml:space="preserve">    "passed": 146,</w:t>
@@ -7196,6 +7198,8 @@
         <w:br/>
         <w:t xml:space="preserve">  "frontend": {</w:t>
         <w:br/>
+        <w:t xml:space="preserve">    "verified_source_commit": "5f8ef526de1fc0be691dc44ad5a5f974f8f856ee",</w:t>
+        <w:br/>
         <w:t xml:space="preserve">    "command": "npm --prefix frontend test",</w:t>
         <w:br/>
         <w:t xml:space="preserve">    "passed": 67,</w:t>
@@ -7205,6 +7209,8 @@
         <w:t xml:space="preserve">  },</w:t>
         <w:br/>
         <w:t xml:space="preserve">  "build": {</w:t>
+        <w:br/>
+        <w:t xml:space="preserve">    "verified_source_commit": "5f8ef526de1fc0be691dc44ad5a5f974f8f856ee",</w:t>
         <w:br/>
         <w:t xml:space="preserve">    "command": "npm --prefix frontend run build",</w:t>
         <w:br/>
@@ -7239,6 +7245,8 @@
         <w:t xml:space="preserve">  },</w:t>
         <w:br/>
         <w:t xml:space="preserve">  "browser_e2e": {</w:t>
+        <w:br/>
+        <w:t xml:space="preserve">    "verified_source_commit": "5f8ef526de1fc0be691dc44ad5a5f974f8f856ee",</w:t>
         <w:br/>
         <w:t xml:space="preserve">    "command": "npm --prefix frontend run test:e2e",</w:t>
         <w:br/>
@@ -7404,7 +7412,7 @@
         <w:br/>
         <w:t xml:space="preserve">  "github_ci": {</w:t>
         <w:br/>
-        <w:t xml:space="preserve">    "result": "At source head 5f8ef52 both container jobs and push synthetic job passed; pull_request synthetic job was still running at the observed snapshot. Publication head needs live checks. CI does not validate the authenticated external Preview.",</w:t>
+        <w:t xml:space="preserve">    "result": "All four CI checks passed on 0054a93f7beb8a132292fb0e26aedb41d9a5f80b; no reviews or unresolved threads at the final-pass snapshot. The documentation correction and regenerated publication require their own live checks. CI does not validate authenticated external Preview.",</w:t>
         <w:br/>
         <w:t xml:space="preserve">    "workflow": ".github/workflows/verify.yml",</w:t>
         <w:br/>
@@ -7453,6 +7461,20 @@
         <w:t xml:space="preserve">    "configuration_impact": "Preview run defaults ITLES_COOKIE_SECURE to 1 for HTTPS; local HTTP tests explicitly use 0. No new required variables, secrets, schema, IAM, DNS, Terraform, cron, OAuth, webhook or feature-flag provisioning. No project script overrides retained.",</w:t>
         <w:br/>
         <w:t xml:space="preserve">    "before_merge": "Restore managed Preview and verify user-facing HTTPS standalone demo admission, /me, reload and logout. Do not merge on isolated CI alone."</w:t>
+        <w:br/>
+        <w:t xml:space="preserve">  },</w:t>
+        <w:br/>
+        <w:t xml:space="preserve">  "final_release_audit": {</w:t>
+        <w:br/>
+        <w:t xml:space="preserve">    "source_commit": "6236586f428b52e9dd088427d399c14da8e53c62",</w:t>
+        <w:br/>
+        <w:t xml:space="preserve">    "change": "Documentation only: README local HTTP command explicitly sets Secure=0; README and HANDOFF now agree that public HTTPS Preview defaults to Secure=1. No executable code changed after 5f8ef52.",</w:t>
+        <w:br/>
+        <w:t xml:space="preserve">    "audit": "Full base/head configuration and release audit completed; no further migration, secret, infrastructure or external-service provisioning required. Managed Preview lifecycle and external acceptance remain unresolved.",</w:t>
+        <w:br/>
+        <w:t xml:space="preserve">    "validation": "Source fingerprint, six publication hashes, verification copy and both source ZIPs checked byte-for-byte; focused delivery/deployment tests rerun for this publication.",</w:t>
+        <w:br/>
+        <w:t xml:space="preserve">    "preview_recheck": "preview_start still returns old terminated process; sandbox_ports confirms no listener on 3000. No successful restart or external session validation claimed."</w:t>
         <w:br/>
         <w:t xml:space="preserve">  },</w:t>
         <w:br/>

</xml_diff>